<commit_message>
Fix HRBP - KR Diaco
</commit_message>
<xml_diff>
--- a/webapp/templates/word/Kit_Retiro_Diaco.docx
+++ b/webapp/templates/word/Kit_Retiro_Diaco.docx
@@ -28,25 +28,7 @@
           <w:sz w:val="22"/>
           <w:szCs w:val="22"/>
         </w:rPr>
-        <w:t>[[</w:t>
-      </w:r>
-      <w:proofErr w:type="spellStart"/>
-      <w:r>
-        <w:rPr>
-          <w:rFonts w:ascii="Barlow" w:eastAsia="Barlow" w:hAnsi="Barlow" w:cs="Barlow"/>
-          <w:sz w:val="22"/>
-          <w:szCs w:val="22"/>
-        </w:rPr>
-        <w:t>CiudadFecha</w:t>
-      </w:r>
-      <w:proofErr w:type="spellEnd"/>
-      <w:r>
-        <w:rPr>
-          <w:rFonts w:ascii="Barlow" w:eastAsia="Barlow" w:hAnsi="Barlow" w:cs="Barlow"/>
-          <w:sz w:val="22"/>
-          <w:szCs w:val="22"/>
-        </w:rPr>
-        <w:t>]]</w:t>
+        <w:t>[[CiudadFecha]]</w:t>
       </w:r>
     </w:p>
     <w:p>
@@ -122,16 +104,7 @@
           <w:sz w:val="22"/>
           <w:szCs w:val="22"/>
         </w:rPr>
-        <w:t>[[</w:t>
-      </w:r>
-      <w:proofErr w:type="spellStart"/>
-      <w:r>
-        <w:rPr>
-          <w:rFonts w:ascii="Barlow" w:eastAsia="Barlow" w:hAnsi="Barlow" w:cs="Barlow"/>
-          <w:sz w:val="22"/>
-          <w:szCs w:val="22"/>
-        </w:rPr>
-        <w:t>Ciudad</w:t>
+        <w:t>[[Ciudad</w:t>
       </w:r>
       <w:r>
         <w:rPr>
@@ -141,7 +114,6 @@
         </w:rPr>
         <w:t>Firma</w:t>
       </w:r>
-      <w:proofErr w:type="spellEnd"/>
       <w:r>
         <w:rPr>
           <w:rFonts w:ascii="Barlow" w:eastAsia="Barlow" w:hAnsi="Barlow" w:cs="Barlow"/>
@@ -555,8 +527,18 @@
           <w:szCs w:val="22"/>
           <w:u w:val="single"/>
         </w:rPr>
-        <w:t>_________________________________________</w:t>
-      </w:r>
+        <w:t>__________________________________________</w:t>
+      </w:r>
+    </w:p>
+    <w:p>
+      <w:pPr>
+        <w:jc w:val="both"/>
+        <w:rPr>
+          <w:rFonts w:ascii="Barlow" w:eastAsia="Barlow" w:hAnsi="Barlow" w:cs="Barlow"/>
+          <w:sz w:val="22"/>
+          <w:szCs w:val="22"/>
+        </w:rPr>
+      </w:pPr>
     </w:p>
     <w:p>
       <w:pPr>
@@ -567,6 +549,30 @@
           <w:bCs/>
           <w:sz w:val="22"/>
           <w:szCs w:val="22"/>
+          <w:lang w:val="en-US"/>
+        </w:rPr>
+      </w:pPr>
+      <w:r>
+        <w:rPr>
+          <w:rFonts w:ascii="Barlow" w:eastAsia="Barlow" w:hAnsi="Barlow" w:cs="Barlow"/>
+          <w:b/>
+          <w:bCs/>
+          <w:sz w:val="22"/>
+          <w:szCs w:val="22"/>
+          <w:lang w:val="en-US"/>
+        </w:rPr>
+        <w:t>[[Hrbp]]</w:t>
+      </w:r>
+    </w:p>
+    <w:p>
+      <w:pPr>
+        <w:jc w:val="center"/>
+        <w:rPr>
+          <w:rFonts w:ascii="Barlow" w:eastAsia="Barlow" w:hAnsi="Barlow" w:cs="Barlow"/>
+          <w:b/>
+          <w:bCs/>
+          <w:sz w:val="22"/>
+          <w:szCs w:val="22"/>
         </w:rPr>
       </w:pPr>
       <w:r>
@@ -579,18 +585,6 @@
         </w:rPr>
         <w:t>Gestión Personas</w:t>
       </w:r>
-    </w:p>
-    <w:p>
-      <w:pPr>
-        <w:jc w:val="center"/>
-        <w:rPr>
-          <w:rFonts w:ascii="Barlow" w:eastAsia="Barlow" w:hAnsi="Barlow" w:cs="Barlow"/>
-          <w:i/>
-          <w:iCs/>
-          <w:sz w:val="22"/>
-          <w:szCs w:val="22"/>
-        </w:rPr>
-      </w:pPr>
     </w:p>
     <w:p>
       <w:pPr>
@@ -747,26 +741,7 @@
           <w:sz w:val="22"/>
           <w:szCs w:val="22"/>
         </w:rPr>
-        <w:lastRenderedPageBreak/>
-        <w:t>[[</w:t>
-      </w:r>
-      <w:proofErr w:type="spellStart"/>
-      <w:r>
-        <w:rPr>
-          <w:rFonts w:ascii="Barlow" w:eastAsia="Barlow" w:hAnsi="Barlow" w:cs="Barlow"/>
-          <w:sz w:val="22"/>
-          <w:szCs w:val="22"/>
-        </w:rPr>
-        <w:t>CiudadFecha</w:t>
-      </w:r>
-      <w:proofErr w:type="spellEnd"/>
-      <w:r>
-        <w:rPr>
-          <w:rFonts w:ascii="Barlow" w:eastAsia="Barlow" w:hAnsi="Barlow" w:cs="Barlow"/>
-          <w:sz w:val="22"/>
-          <w:szCs w:val="22"/>
-        </w:rPr>
-        <w:t>]]</w:t>
+        <w:t>[[CiudadFecha]]</w:t>
       </w:r>
     </w:p>
     <w:p>
@@ -842,16 +817,7 @@
           <w:sz w:val="22"/>
           <w:szCs w:val="22"/>
         </w:rPr>
-        <w:t>[[</w:t>
-      </w:r>
-      <w:proofErr w:type="spellStart"/>
-      <w:r>
-        <w:rPr>
-          <w:rFonts w:ascii="Barlow" w:eastAsia="Barlow" w:hAnsi="Barlow" w:cs="Barlow"/>
-          <w:sz w:val="22"/>
-          <w:szCs w:val="22"/>
-        </w:rPr>
-        <w:t>Ciudad</w:t>
+        <w:t>[[Ciudad</w:t>
       </w:r>
       <w:r>
         <w:rPr>
@@ -861,7 +827,6 @@
         </w:rPr>
         <w:t>Firma</w:t>
       </w:r>
-      <w:proofErr w:type="spellEnd"/>
       <w:r>
         <w:rPr>
           <w:rFonts w:ascii="Barlow" w:eastAsia="Barlow" w:hAnsi="Barlow" w:cs="Barlow"/>
@@ -1235,26 +1200,70 @@
           <w:sz w:val="22"/>
           <w:szCs w:val="22"/>
         </w:rPr>
+        <w:t>[[Ciudad</w:t>
+      </w:r>
+      <w:r>
+        <w:rPr>
+          <w:rFonts w:ascii="Barlow" w:eastAsia="Barlow" w:hAnsi="Barlow" w:cs="Barlow"/>
+          <w:sz w:val="22"/>
+          <w:szCs w:val="22"/>
+        </w:rPr>
+        <w:t>Residencia</w:t>
+      </w:r>
+      <w:r>
+        <w:rPr>
+          <w:rFonts w:ascii="Barlow" w:eastAsia="Barlow" w:hAnsi="Barlow" w:cs="Barlow"/>
+          <w:sz w:val="22"/>
+          <w:szCs w:val="22"/>
+        </w:rPr>
+        <w:t>]]</w:t>
+      </w:r>
+    </w:p>
+    <w:p>
+      <w:pPr>
+        <w:ind w:left="720"/>
+        <w:jc w:val="both"/>
+        <w:rPr>
+          <w:rFonts w:ascii="Barlow" w:eastAsia="Barlow" w:hAnsi="Barlow" w:cs="Barlow"/>
+        </w:rPr>
+      </w:pPr>
+    </w:p>
+    <w:p>
+      <w:pPr>
+        <w:ind w:left="720"/>
+        <w:jc w:val="both"/>
+        <w:rPr>
+          <w:rFonts w:ascii="Barlow" w:eastAsia="Barlow" w:hAnsi="Barlow" w:cs="Barlow"/>
+        </w:rPr>
+      </w:pPr>
+      <w:r>
+        <w:rPr>
+          <w:rFonts w:ascii="Barlow" w:eastAsia="Barlow" w:hAnsi="Barlow" w:cs="Barlow"/>
+        </w:rPr>
+        <w:t xml:space="preserve">Dirección (incluir el barrio/sector):       </w:t>
+      </w:r>
+      <w:r>
+        <w:rPr>
+          <w:rFonts w:ascii="Barlow" w:eastAsia="Barlow" w:hAnsi="Barlow" w:cs="Barlow"/>
+        </w:rPr>
+        <w:tab/>
+      </w:r>
+      <w:r>
+        <w:rPr>
+          <w:rFonts w:ascii="Barlow" w:eastAsia="Barlow" w:hAnsi="Barlow" w:cs="Barlow"/>
+          <w:sz w:val="22"/>
+          <w:szCs w:val="22"/>
+        </w:rPr>
         <w:t>[[</w:t>
       </w:r>
-      <w:proofErr w:type="spellStart"/>
-      <w:r>
-        <w:rPr>
-          <w:rFonts w:ascii="Barlow" w:eastAsia="Barlow" w:hAnsi="Barlow" w:cs="Barlow"/>
-          <w:sz w:val="22"/>
-          <w:szCs w:val="22"/>
-        </w:rPr>
-        <w:t>Ciudad</w:t>
-      </w:r>
-      <w:r>
-        <w:rPr>
-          <w:rFonts w:ascii="Barlow" w:eastAsia="Barlow" w:hAnsi="Barlow" w:cs="Barlow"/>
-          <w:sz w:val="22"/>
-          <w:szCs w:val="22"/>
-        </w:rPr>
-        <w:t>Residencia</w:t>
-      </w:r>
-      <w:proofErr w:type="spellEnd"/>
+      <w:r>
+        <w:rPr>
+          <w:rFonts w:ascii="Barlow" w:eastAsia="Barlow" w:hAnsi="Barlow" w:cs="Barlow"/>
+          <w:sz w:val="22"/>
+          <w:szCs w:val="22"/>
+        </w:rPr>
+        <w:t>Direccion</w:t>
+      </w:r>
       <w:r>
         <w:rPr>
           <w:rFonts w:ascii="Barlow" w:eastAsia="Barlow" w:hAnsi="Barlow" w:cs="Barlow"/>
@@ -1275,17 +1284,19 @@
     </w:p>
     <w:p>
       <w:pPr>
-        <w:ind w:left="720"/>
-        <w:jc w:val="both"/>
-        <w:rPr>
-          <w:rFonts w:ascii="Barlow" w:eastAsia="Barlow" w:hAnsi="Barlow" w:cs="Barlow"/>
-        </w:rPr>
-      </w:pPr>
-      <w:r>
-        <w:rPr>
-          <w:rFonts w:ascii="Barlow" w:eastAsia="Barlow" w:hAnsi="Barlow" w:cs="Barlow"/>
-        </w:rPr>
-        <w:t xml:space="preserve">Dirección (incluir el barrio/sector):       </w:t>
+        <w:ind w:firstLine="720"/>
+        <w:jc w:val="both"/>
+        <w:rPr>
+          <w:rFonts w:ascii="Barlow" w:eastAsia="Barlow" w:hAnsi="Barlow" w:cs="Barlow"/>
+          <w:sz w:val="22"/>
+          <w:szCs w:val="22"/>
+        </w:rPr>
+      </w:pPr>
+      <w:r>
+        <w:rPr>
+          <w:rFonts w:ascii="Barlow" w:eastAsia="Barlow" w:hAnsi="Barlow" w:cs="Barlow"/>
+        </w:rPr>
+        <w:t xml:space="preserve">Teléfono: </w:t>
       </w:r>
       <w:r>
         <w:rPr>
@@ -1296,88 +1307,29 @@
       <w:r>
         <w:rPr>
           <w:rFonts w:ascii="Barlow" w:eastAsia="Barlow" w:hAnsi="Barlow" w:cs="Barlow"/>
+        </w:rPr>
+        <w:tab/>
+      </w:r>
+      <w:r>
+        <w:rPr>
+          <w:rFonts w:ascii="Barlow" w:eastAsia="Barlow" w:hAnsi="Barlow" w:cs="Barlow"/>
+        </w:rPr>
+        <w:tab/>
+      </w:r>
+      <w:r>
+        <w:rPr>
+          <w:rFonts w:ascii="Barlow" w:eastAsia="Barlow" w:hAnsi="Barlow" w:cs="Barlow"/>
+        </w:rPr>
+        <w:tab/>
+      </w:r>
+      <w:r>
+        <w:rPr>
+          <w:rFonts w:ascii="Barlow" w:eastAsia="Barlow" w:hAnsi="Barlow" w:cs="Barlow"/>
           <w:sz w:val="22"/>
           <w:szCs w:val="22"/>
         </w:rPr>
         <w:t>[[</w:t>
       </w:r>
-      <w:proofErr w:type="spellStart"/>
-      <w:r>
-        <w:rPr>
-          <w:rFonts w:ascii="Barlow" w:eastAsia="Barlow" w:hAnsi="Barlow" w:cs="Barlow"/>
-          <w:sz w:val="22"/>
-          <w:szCs w:val="22"/>
-        </w:rPr>
-        <w:t>Direccion</w:t>
-      </w:r>
-      <w:proofErr w:type="spellEnd"/>
-      <w:r>
-        <w:rPr>
-          <w:rFonts w:ascii="Barlow" w:eastAsia="Barlow" w:hAnsi="Barlow" w:cs="Barlow"/>
-          <w:sz w:val="22"/>
-          <w:szCs w:val="22"/>
-        </w:rPr>
-        <w:t>]]</w:t>
-      </w:r>
-    </w:p>
-    <w:p>
-      <w:pPr>
-        <w:ind w:left="720"/>
-        <w:jc w:val="both"/>
-        <w:rPr>
-          <w:rFonts w:ascii="Barlow" w:eastAsia="Barlow" w:hAnsi="Barlow" w:cs="Barlow"/>
-        </w:rPr>
-      </w:pPr>
-    </w:p>
-    <w:p>
-      <w:pPr>
-        <w:ind w:firstLine="720"/>
-        <w:jc w:val="both"/>
-        <w:rPr>
-          <w:rFonts w:ascii="Barlow" w:eastAsia="Barlow" w:hAnsi="Barlow" w:cs="Barlow"/>
-          <w:sz w:val="22"/>
-          <w:szCs w:val="22"/>
-        </w:rPr>
-      </w:pPr>
-      <w:r>
-        <w:rPr>
-          <w:rFonts w:ascii="Barlow" w:eastAsia="Barlow" w:hAnsi="Barlow" w:cs="Barlow"/>
-        </w:rPr>
-        <w:t xml:space="preserve">Teléfono: </w:t>
-      </w:r>
-      <w:r>
-        <w:rPr>
-          <w:rFonts w:ascii="Barlow" w:eastAsia="Barlow" w:hAnsi="Barlow" w:cs="Barlow"/>
-        </w:rPr>
-        <w:tab/>
-      </w:r>
-      <w:r>
-        <w:rPr>
-          <w:rFonts w:ascii="Barlow" w:eastAsia="Barlow" w:hAnsi="Barlow" w:cs="Barlow"/>
-        </w:rPr>
-        <w:tab/>
-      </w:r>
-      <w:r>
-        <w:rPr>
-          <w:rFonts w:ascii="Barlow" w:eastAsia="Barlow" w:hAnsi="Barlow" w:cs="Barlow"/>
-        </w:rPr>
-        <w:tab/>
-      </w:r>
-      <w:r>
-        <w:rPr>
-          <w:rFonts w:ascii="Barlow" w:eastAsia="Barlow" w:hAnsi="Barlow" w:cs="Barlow"/>
-        </w:rPr>
-        <w:tab/>
-      </w:r>
-      <w:r>
-        <w:rPr>
-          <w:rFonts w:ascii="Barlow" w:eastAsia="Barlow" w:hAnsi="Barlow" w:cs="Barlow"/>
-          <w:sz w:val="22"/>
-          <w:szCs w:val="22"/>
-        </w:rPr>
-        <w:t>[[</w:t>
-      </w:r>
-      <w:proofErr w:type="spellStart"/>
       <w:r>
         <w:rPr>
           <w:rFonts w:ascii="Barlow" w:eastAsia="Barlow" w:hAnsi="Barlow" w:cs="Barlow"/>
@@ -1386,7 +1338,6 @@
         </w:rPr>
         <w:t>Telefono</w:t>
       </w:r>
-      <w:proofErr w:type="spellEnd"/>
       <w:r>
         <w:rPr>
           <w:rFonts w:ascii="Barlow" w:eastAsia="Barlow" w:hAnsi="Barlow" w:cs="Barlow"/>
@@ -1791,35 +1742,15 @@
           <w:sz w:val="22"/>
           <w:szCs w:val="22"/>
         </w:rPr>
-        <w:t xml:space="preserve"> [[Nombre]</w:t>
-      </w:r>
-      <w:proofErr w:type="gramStart"/>
-      <w:r>
-        <w:rPr>
-          <w:rFonts w:ascii="Barlow" w:eastAsia="Barlow" w:hAnsi="Barlow" w:cs="Barlow"/>
-          <w:b/>
-          <w:bCs/>
-          <w:sz w:val="22"/>
-          <w:szCs w:val="22"/>
-        </w:rPr>
-        <w:t xml:space="preserve">]  </w:t>
-      </w:r>
-      <w:r>
-        <w:rPr>
-          <w:rFonts w:ascii="Barlow" w:eastAsia="Barlow" w:hAnsi="Barlow" w:cs="Barlow"/>
-          <w:sz w:val="22"/>
-          <w:szCs w:val="22"/>
-        </w:rPr>
-        <w:t>[</w:t>
-      </w:r>
-      <w:proofErr w:type="gramEnd"/>
-      <w:r>
-        <w:rPr>
-          <w:rFonts w:ascii="Barlow" w:eastAsia="Barlow" w:hAnsi="Barlow" w:cs="Barlow"/>
-          <w:sz w:val="22"/>
-          <w:szCs w:val="22"/>
-        </w:rPr>
-        <w:t xml:space="preserve">[Identificado]] con cédula de ciudadanía número </w:t>
+        <w:t xml:space="preserve"> [[Nombre]]  </w:t>
+      </w:r>
+      <w:r>
+        <w:rPr>
+          <w:rFonts w:ascii="Barlow" w:eastAsia="Barlow" w:hAnsi="Barlow" w:cs="Barlow"/>
+          <w:sz w:val="22"/>
+          <w:szCs w:val="22"/>
+        </w:rPr>
+        <w:t xml:space="preserve">[[Identificado]] con cédula de ciudadanía número </w:t>
       </w:r>
       <w:r>
         <w:rPr>
@@ -1847,98 +1778,170 @@
           <w:sz w:val="22"/>
           <w:szCs w:val="22"/>
         </w:rPr>
+        <w:t xml:space="preserve">[[FechaIngreso]] </w:t>
+      </w:r>
+      <w:r>
+        <w:rPr>
+          <w:rFonts w:ascii="Barlow" w:eastAsia="Barlow" w:hAnsi="Barlow" w:cs="Barlow"/>
+          <w:sz w:val="22"/>
+          <w:szCs w:val="22"/>
+        </w:rPr>
+        <w:t xml:space="preserve">hasta el </w:t>
+      </w:r>
+      <w:r>
+        <w:rPr>
+          <w:rFonts w:ascii="Barlow" w:eastAsia="Barlow" w:hAnsi="Barlow" w:cs="Barlow"/>
+          <w:b/>
+          <w:bCs/>
+          <w:sz w:val="22"/>
+          <w:szCs w:val="22"/>
+        </w:rPr>
+        <w:t xml:space="preserve">[[FechaSalida]] </w:t>
+      </w:r>
+    </w:p>
+    <w:p>
+      <w:pPr>
+        <w:tabs>
+          <w:tab w:val="left" w:pos="0"/>
+          <w:tab w:val="left" w:pos="4395"/>
+        </w:tabs>
+        <w:jc w:val="both"/>
+        <w:rPr>
+          <w:rFonts w:ascii="Barlow" w:eastAsia="Barlow" w:hAnsi="Barlow" w:cs="Barlow"/>
+          <w:sz w:val="22"/>
+          <w:szCs w:val="22"/>
+        </w:rPr>
+      </w:pPr>
+    </w:p>
+    <w:p>
+      <w:pPr>
+        <w:tabs>
+          <w:tab w:val="left" w:pos="0"/>
+          <w:tab w:val="left" w:pos="4395"/>
+        </w:tabs>
+        <w:jc w:val="both"/>
+        <w:rPr>
+          <w:rFonts w:ascii="Barlow" w:eastAsia="Barlow" w:hAnsi="Barlow" w:cs="Barlow"/>
+          <w:sz w:val="22"/>
+          <w:szCs w:val="22"/>
+        </w:rPr>
+      </w:pPr>
+      <w:r>
+        <w:rPr>
+          <w:rFonts w:ascii="Barlow" w:eastAsia="Barlow" w:hAnsi="Barlow" w:cs="Barlow"/>
+          <w:sz w:val="22"/>
+          <w:szCs w:val="22"/>
+        </w:rPr>
+        <w:tab/>
+      </w:r>
+    </w:p>
+    <w:p>
+      <w:pPr>
+        <w:tabs>
+          <w:tab w:val="left" w:pos="0"/>
+        </w:tabs>
+        <w:rPr>
+          <w:rFonts w:ascii="Barlow" w:eastAsia="Barlow" w:hAnsi="Barlow" w:cs="Barlow"/>
+          <w:sz w:val="22"/>
+          <w:szCs w:val="22"/>
+        </w:rPr>
+      </w:pPr>
+      <w:r>
+        <w:rPr>
+          <w:rFonts w:ascii="Barlow" w:eastAsia="Barlow" w:hAnsi="Barlow" w:cs="Barlow"/>
+          <w:b/>
+          <w:bCs/>
+          <w:sz w:val="22"/>
+          <w:szCs w:val="22"/>
+        </w:rPr>
+        <w:t>Ultimo cargo desempeñado</w:t>
+      </w:r>
+      <w:r>
+        <w:rPr>
+          <w:rFonts w:ascii="Barlow" w:eastAsia="Barlow" w:hAnsi="Barlow" w:cs="Barlow"/>
+          <w:sz w:val="22"/>
+          <w:szCs w:val="22"/>
+        </w:rPr>
+        <w:t xml:space="preserve">: </w:t>
+      </w:r>
+      <w:r>
+        <w:rPr>
+          <w:rFonts w:ascii="Barlow" w:eastAsia="Barlow" w:hAnsi="Barlow" w:cs="Barlow"/>
+          <w:sz w:val="22"/>
+          <w:szCs w:val="22"/>
+        </w:rPr>
+        <w:tab/>
+      </w:r>
+      <w:r>
+        <w:rPr>
+          <w:rFonts w:ascii="Barlow" w:eastAsia="Barlow" w:hAnsi="Barlow" w:cs="Barlow"/>
+          <w:sz w:val="22"/>
+          <w:szCs w:val="22"/>
+        </w:rPr>
+        <w:tab/>
+      </w:r>
+      <w:r>
+        <w:rPr>
+          <w:rFonts w:ascii="Barlow" w:eastAsia="Barlow" w:hAnsi="Barlow" w:cs="Barlow"/>
+          <w:sz w:val="22"/>
+          <w:szCs w:val="22"/>
+        </w:rPr>
+        <w:tab/>
+      </w:r>
+      <w:r>
+        <w:rPr>
+          <w:rFonts w:ascii="Barlow" w:eastAsia="Barlow" w:hAnsi="Barlow" w:cs="Barlow"/>
+          <w:sz w:val="22"/>
+          <w:szCs w:val="22"/>
+        </w:rPr>
         <w:t>[[</w:t>
       </w:r>
-      <w:proofErr w:type="spellStart"/>
-      <w:r>
-        <w:rPr>
-          <w:rFonts w:ascii="Barlow" w:eastAsia="Barlow" w:hAnsi="Barlow" w:cs="Barlow"/>
-          <w:b/>
-          <w:bCs/>
-          <w:sz w:val="22"/>
-          <w:szCs w:val="22"/>
-        </w:rPr>
-        <w:t>FechaIngreso</w:t>
-      </w:r>
-      <w:proofErr w:type="spellEnd"/>
-      <w:r>
-        <w:rPr>
-          <w:rFonts w:ascii="Barlow" w:eastAsia="Barlow" w:hAnsi="Barlow" w:cs="Barlow"/>
-          <w:b/>
-          <w:bCs/>
-          <w:sz w:val="22"/>
-          <w:szCs w:val="22"/>
-        </w:rPr>
-        <w:t xml:space="preserve">]] </w:t>
-      </w:r>
-      <w:r>
-        <w:rPr>
-          <w:rFonts w:ascii="Barlow" w:eastAsia="Barlow" w:hAnsi="Barlow" w:cs="Barlow"/>
-          <w:sz w:val="22"/>
-          <w:szCs w:val="22"/>
-        </w:rPr>
-        <w:t xml:space="preserve">hasta el </w:t>
-      </w:r>
-      <w:r>
-        <w:rPr>
-          <w:rFonts w:ascii="Barlow" w:eastAsia="Barlow" w:hAnsi="Barlow" w:cs="Barlow"/>
-          <w:b/>
-          <w:bCs/>
-          <w:sz w:val="22"/>
-          <w:szCs w:val="22"/>
-        </w:rPr>
-        <w:t>[[</w:t>
-      </w:r>
-      <w:proofErr w:type="spellStart"/>
-      <w:r>
-        <w:rPr>
-          <w:rFonts w:ascii="Barlow" w:eastAsia="Barlow" w:hAnsi="Barlow" w:cs="Barlow"/>
-          <w:b/>
-          <w:bCs/>
-          <w:sz w:val="22"/>
-          <w:szCs w:val="22"/>
-        </w:rPr>
-        <w:t>FechaSalida</w:t>
-      </w:r>
-      <w:proofErr w:type="spellEnd"/>
-      <w:r>
-        <w:rPr>
-          <w:rFonts w:ascii="Barlow" w:eastAsia="Barlow" w:hAnsi="Barlow" w:cs="Barlow"/>
-          <w:b/>
-          <w:bCs/>
-          <w:sz w:val="22"/>
-          <w:szCs w:val="22"/>
-        </w:rPr>
-        <w:t xml:space="preserve">]] </w:t>
-      </w:r>
-    </w:p>
-    <w:p>
-      <w:pPr>
-        <w:tabs>
-          <w:tab w:val="left" w:pos="0"/>
-          <w:tab w:val="left" w:pos="4395"/>
-        </w:tabs>
-        <w:jc w:val="both"/>
-        <w:rPr>
-          <w:rFonts w:ascii="Barlow" w:eastAsia="Barlow" w:hAnsi="Barlow" w:cs="Barlow"/>
-          <w:sz w:val="22"/>
-          <w:szCs w:val="22"/>
-        </w:rPr>
-      </w:pPr>
-    </w:p>
-    <w:p>
-      <w:pPr>
-        <w:tabs>
-          <w:tab w:val="left" w:pos="0"/>
-          <w:tab w:val="left" w:pos="4395"/>
-        </w:tabs>
-        <w:jc w:val="both"/>
-        <w:rPr>
-          <w:rFonts w:ascii="Barlow" w:eastAsia="Barlow" w:hAnsi="Barlow" w:cs="Barlow"/>
-          <w:sz w:val="22"/>
-          <w:szCs w:val="22"/>
-        </w:rPr>
-      </w:pPr>
+      <w:r>
+        <w:rPr>
+          <w:rFonts w:ascii="Barlow" w:eastAsia="Barlow" w:hAnsi="Barlow" w:cs="Barlow"/>
+          <w:sz w:val="22"/>
+          <w:szCs w:val="22"/>
+        </w:rPr>
+        <w:t>Cargo</w:t>
+      </w:r>
+      <w:r>
+        <w:rPr>
+          <w:rFonts w:ascii="Barlow" w:eastAsia="Barlow" w:hAnsi="Barlow" w:cs="Barlow"/>
+          <w:sz w:val="22"/>
+          <w:szCs w:val="22"/>
+        </w:rPr>
+        <w:t>]]</w:t>
+      </w:r>
+    </w:p>
+    <w:p>
+      <w:pPr>
+        <w:tabs>
+          <w:tab w:val="left" w:pos="0"/>
+        </w:tabs>
+        <w:rPr>
+          <w:rFonts w:ascii="Barlow" w:eastAsia="Barlow" w:hAnsi="Barlow" w:cs="Barlow"/>
+          <w:sz w:val="22"/>
+          <w:szCs w:val="22"/>
+        </w:rPr>
+      </w:pPr>
+      <w:r>
+        <w:rPr>
+          <w:rFonts w:ascii="Barlow" w:eastAsia="Barlow" w:hAnsi="Barlow" w:cs="Barlow"/>
+          <w:b/>
+          <w:bCs/>
+          <w:sz w:val="22"/>
+          <w:szCs w:val="22"/>
+        </w:rPr>
+        <w:t>Ciudad de trabajo</w:t>
+      </w:r>
+      <w:r>
+        <w:rPr>
+          <w:rFonts w:ascii="Barlow" w:eastAsia="Barlow" w:hAnsi="Barlow" w:cs="Barlow"/>
+          <w:sz w:val="22"/>
+          <w:szCs w:val="22"/>
+        </w:rPr>
+        <w:t xml:space="preserve">: </w:t>
+      </w:r>
       <w:r>
         <w:rPr>
           <w:rFonts w:ascii="Barlow" w:eastAsia="Barlow" w:hAnsi="Barlow" w:cs="Barlow"/>
@@ -1947,36 +1950,6 @@
         </w:rPr>
         <w:tab/>
       </w:r>
-    </w:p>
-    <w:p>
-      <w:pPr>
-        <w:tabs>
-          <w:tab w:val="left" w:pos="0"/>
-        </w:tabs>
-        <w:rPr>
-          <w:rFonts w:ascii="Barlow" w:eastAsia="Barlow" w:hAnsi="Barlow" w:cs="Barlow"/>
-          <w:sz w:val="22"/>
-          <w:szCs w:val="22"/>
-        </w:rPr>
-      </w:pPr>
-      <w:r>
-        <w:rPr>
-          <w:rFonts w:ascii="Barlow" w:eastAsia="Barlow" w:hAnsi="Barlow" w:cs="Barlow"/>
-          <w:b/>
-          <w:bCs/>
-          <w:sz w:val="22"/>
-          <w:szCs w:val="22"/>
-        </w:rPr>
-        <w:t>Ultimo cargo desempeñado</w:t>
-      </w:r>
-      <w:r>
-        <w:rPr>
-          <w:rFonts w:ascii="Barlow" w:eastAsia="Barlow" w:hAnsi="Barlow" w:cs="Barlow"/>
-          <w:sz w:val="22"/>
-          <w:szCs w:val="22"/>
-        </w:rPr>
-        <w:t xml:space="preserve">: </w:t>
-      </w:r>
       <w:r>
         <w:rPr>
           <w:rFonts w:ascii="Barlow" w:eastAsia="Barlow" w:hAnsi="Barlow" w:cs="Barlow"/>
@@ -2007,102 +1980,7 @@
           <w:sz w:val="22"/>
           <w:szCs w:val="22"/>
         </w:rPr>
-        <w:t>[[</w:t>
-      </w:r>
-      <w:r>
-        <w:rPr>
-          <w:rFonts w:ascii="Barlow" w:eastAsia="Barlow" w:hAnsi="Barlow" w:cs="Barlow"/>
-          <w:sz w:val="22"/>
-          <w:szCs w:val="22"/>
-        </w:rPr>
-        <w:t>Cargo</w:t>
-      </w:r>
-      <w:r>
-        <w:rPr>
-          <w:rFonts w:ascii="Barlow" w:eastAsia="Barlow" w:hAnsi="Barlow" w:cs="Barlow"/>
-          <w:sz w:val="22"/>
-          <w:szCs w:val="22"/>
-        </w:rPr>
-        <w:t>]]</w:t>
-      </w:r>
-    </w:p>
-    <w:p>
-      <w:pPr>
-        <w:tabs>
-          <w:tab w:val="left" w:pos="0"/>
-        </w:tabs>
-        <w:rPr>
-          <w:rFonts w:ascii="Barlow" w:eastAsia="Barlow" w:hAnsi="Barlow" w:cs="Barlow"/>
-          <w:sz w:val="22"/>
-          <w:szCs w:val="22"/>
-        </w:rPr>
-      </w:pPr>
-      <w:r>
-        <w:rPr>
-          <w:rFonts w:ascii="Barlow" w:eastAsia="Barlow" w:hAnsi="Barlow" w:cs="Barlow"/>
-          <w:b/>
-          <w:bCs/>
-          <w:sz w:val="22"/>
-          <w:szCs w:val="22"/>
-        </w:rPr>
-        <w:t>Ciudad de trabajo</w:t>
-      </w:r>
-      <w:r>
-        <w:rPr>
-          <w:rFonts w:ascii="Barlow" w:eastAsia="Barlow" w:hAnsi="Barlow" w:cs="Barlow"/>
-          <w:sz w:val="22"/>
-          <w:szCs w:val="22"/>
-        </w:rPr>
-        <w:t xml:space="preserve">: </w:t>
-      </w:r>
-      <w:r>
-        <w:rPr>
-          <w:rFonts w:ascii="Barlow" w:eastAsia="Barlow" w:hAnsi="Barlow" w:cs="Barlow"/>
-          <w:sz w:val="22"/>
-          <w:szCs w:val="22"/>
-        </w:rPr>
-        <w:tab/>
-      </w:r>
-      <w:r>
-        <w:rPr>
-          <w:rFonts w:ascii="Barlow" w:eastAsia="Barlow" w:hAnsi="Barlow" w:cs="Barlow"/>
-          <w:sz w:val="22"/>
-          <w:szCs w:val="22"/>
-        </w:rPr>
-        <w:tab/>
-      </w:r>
-      <w:r>
-        <w:rPr>
-          <w:rFonts w:ascii="Barlow" w:eastAsia="Barlow" w:hAnsi="Barlow" w:cs="Barlow"/>
-          <w:sz w:val="22"/>
-          <w:szCs w:val="22"/>
-        </w:rPr>
-        <w:tab/>
-      </w:r>
-      <w:r>
-        <w:rPr>
-          <w:rFonts w:ascii="Barlow" w:eastAsia="Barlow" w:hAnsi="Barlow" w:cs="Barlow"/>
-          <w:sz w:val="22"/>
-          <w:szCs w:val="22"/>
-        </w:rPr>
-        <w:tab/>
-      </w:r>
-      <w:r>
-        <w:rPr>
-          <w:rFonts w:ascii="Barlow" w:eastAsia="Barlow" w:hAnsi="Barlow" w:cs="Barlow"/>
-          <w:sz w:val="22"/>
-          <w:szCs w:val="22"/>
-        </w:rPr>
-        <w:t>[[</w:t>
-      </w:r>
-      <w:proofErr w:type="spellStart"/>
-      <w:r>
-        <w:rPr>
-          <w:rFonts w:ascii="Barlow" w:eastAsia="Barlow" w:hAnsi="Barlow" w:cs="Barlow"/>
-          <w:sz w:val="22"/>
-          <w:szCs w:val="22"/>
-        </w:rPr>
-        <w:t>Ciudad</w:t>
+        <w:t>[[Ciudad</w:t>
       </w:r>
       <w:r>
         <w:rPr>
@@ -2112,7 +1990,6 @@
         </w:rPr>
         <w:t>Firma</w:t>
       </w:r>
-      <w:proofErr w:type="spellEnd"/>
       <w:r>
         <w:rPr>
           <w:rFonts w:ascii="Barlow" w:eastAsia="Barlow" w:hAnsi="Barlow" w:cs="Barlow"/>
@@ -2239,16 +2116,7 @@
           <w:sz w:val="22"/>
           <w:szCs w:val="22"/>
         </w:rPr>
-        <w:t>[[</w:t>
-      </w:r>
-      <w:proofErr w:type="spellStart"/>
-      <w:r>
-        <w:rPr>
-          <w:rFonts w:ascii="Barlow" w:eastAsia="Barlow" w:hAnsi="Barlow" w:cs="Barlow"/>
-          <w:sz w:val="22"/>
-          <w:szCs w:val="22"/>
-        </w:rPr>
-        <w:t>Ciudad</w:t>
+        <w:t>[[Ciudad</w:t>
       </w:r>
       <w:r>
         <w:rPr>
@@ -2258,7 +2126,6 @@
         </w:rPr>
         <w:t>Firma</w:t>
       </w:r>
-      <w:proofErr w:type="spellEnd"/>
       <w:r>
         <w:rPr>
           <w:rFonts w:ascii="Barlow" w:eastAsia="Barlow" w:hAnsi="Barlow" w:cs="Barlow"/>

</xml_diff>